<commit_message>
[UPDATE] Slide 09 Export redesign (Tech × Byredo) + HWPX download in panel
- Rewrite export-slide.tsx with .xform BEM block: paper preview (left, full A4-style card) + right panel
- Right panel: dark hero with progress bar + dual download cards (HWPX primary, DOCX secondary)
- Per-section preview shows numbered tag + word-count badge with ±10% color coding
- AI quality block + 5-item submission checklist below downloads
- Rewrite export.css from scratch with monochrome editorial styling
- Plumb downloadHwpx prop from lecture-studio.tsx

Co-Authored-By: Claude Opus 4.7 (1M context) <noreply@anthropic.com>
</commit_message>
<xml_diff>
--- a/artifacts/professor-guide/ai-cover-letter-professor-guide.docx
+++ b/artifacts/professor-guide/ai-cover-letter-professor-guide.docx
@@ -515,7 +515,7 @@
       <w:r>
         <w:drawing>
           <wp:inline xmlns:a="http://schemas.openxmlformats.org/drawingml/2006/main" xmlns:pic="http://schemas.openxmlformats.org/drawingml/2006/picture">
-            <wp:extent cx="10287000" cy="5786438"/>
+            <wp:extent cx="9875520" cy="5554980"/>
             <wp:docPr id="1" name="Picture 1"/>
             <wp:cNvGraphicFramePr>
               <a:graphicFrameLocks noChangeAspect="1"/>
@@ -536,7 +536,7 @@
                   <pic:spPr>
                     <a:xfrm>
                       <a:off x="0" y="0"/>
-                      <a:ext cx="10287000" cy="5786438"/>
+                      <a:ext cx="9875520" cy="5554980"/>
                     </a:xfrm>
                     <a:prstGeom prst="rect"/>
                   </pic:spPr>
@@ -1015,7 +1015,7 @@
       <w:r>
         <w:drawing>
           <wp:inline xmlns:a="http://schemas.openxmlformats.org/drawingml/2006/main" xmlns:pic="http://schemas.openxmlformats.org/drawingml/2006/picture">
-            <wp:extent cx="10287000" cy="5786438"/>
+            <wp:extent cx="9875520" cy="5554980"/>
             <wp:docPr id="2" name="Picture 2"/>
             <wp:cNvGraphicFramePr>
               <a:graphicFrameLocks noChangeAspect="1"/>
@@ -1036,7 +1036,7 @@
                   <pic:spPr>
                     <a:xfrm>
                       <a:off x="0" y="0"/>
-                      <a:ext cx="10287000" cy="5786438"/>
+                      <a:ext cx="9875520" cy="5554980"/>
                     </a:xfrm>
                     <a:prstGeom prst="rect"/>
                   </pic:spPr>
@@ -1515,7 +1515,7 @@
       <w:r>
         <w:drawing>
           <wp:inline xmlns:a="http://schemas.openxmlformats.org/drawingml/2006/main" xmlns:pic="http://schemas.openxmlformats.org/drawingml/2006/picture">
-            <wp:extent cx="10287000" cy="5786438"/>
+            <wp:extent cx="9875520" cy="5554980"/>
             <wp:docPr id="3" name="Picture 3"/>
             <wp:cNvGraphicFramePr>
               <a:graphicFrameLocks noChangeAspect="1"/>
@@ -1536,7 +1536,7 @@
                   <pic:spPr>
                     <a:xfrm>
                       <a:off x="0" y="0"/>
-                      <a:ext cx="10287000" cy="5786438"/>
+                      <a:ext cx="9875520" cy="5554980"/>
                     </a:xfrm>
                     <a:prstGeom prst="rect"/>
                   </pic:spPr>
@@ -2015,7 +2015,7 @@
       <w:r>
         <w:drawing>
           <wp:inline xmlns:a="http://schemas.openxmlformats.org/drawingml/2006/main" xmlns:pic="http://schemas.openxmlformats.org/drawingml/2006/picture">
-            <wp:extent cx="10287000" cy="5786438"/>
+            <wp:extent cx="9875520" cy="5554980"/>
             <wp:docPr id="4" name="Picture 4"/>
             <wp:cNvGraphicFramePr>
               <a:graphicFrameLocks noChangeAspect="1"/>
@@ -2036,7 +2036,7 @@
                   <pic:spPr>
                     <a:xfrm>
                       <a:off x="0" y="0"/>
-                      <a:ext cx="10287000" cy="5786438"/>
+                      <a:ext cx="9875520" cy="5554980"/>
                     </a:xfrm>
                     <a:prstGeom prst="rect"/>
                   </pic:spPr>
@@ -2515,7 +2515,7 @@
       <w:r>
         <w:drawing>
           <wp:inline xmlns:a="http://schemas.openxmlformats.org/drawingml/2006/main" xmlns:pic="http://schemas.openxmlformats.org/drawingml/2006/picture">
-            <wp:extent cx="10287000" cy="5786438"/>
+            <wp:extent cx="9875520" cy="5554980"/>
             <wp:docPr id="5" name="Picture 5"/>
             <wp:cNvGraphicFramePr>
               <a:graphicFrameLocks noChangeAspect="1"/>
@@ -2536,7 +2536,7 @@
                   <pic:spPr>
                     <a:xfrm>
                       <a:off x="0" y="0"/>
-                      <a:ext cx="10287000" cy="5786438"/>
+                      <a:ext cx="9875520" cy="5554980"/>
                     </a:xfrm>
                     <a:prstGeom prst="rect"/>
                   </pic:spPr>
@@ -3015,7 +3015,7 @@
       <w:r>
         <w:drawing>
           <wp:inline xmlns:a="http://schemas.openxmlformats.org/drawingml/2006/main" xmlns:pic="http://schemas.openxmlformats.org/drawingml/2006/picture">
-            <wp:extent cx="10287000" cy="5786438"/>
+            <wp:extent cx="9875520" cy="5554980"/>
             <wp:docPr id="6" name="Picture 6"/>
             <wp:cNvGraphicFramePr>
               <a:graphicFrameLocks noChangeAspect="1"/>
@@ -3036,7 +3036,7 @@
                   <pic:spPr>
                     <a:xfrm>
                       <a:off x="0" y="0"/>
-                      <a:ext cx="10287000" cy="5786438"/>
+                      <a:ext cx="9875520" cy="5554980"/>
                     </a:xfrm>
                     <a:prstGeom prst="rect"/>
                   </pic:spPr>
@@ -3515,7 +3515,7 @@
       <w:r>
         <w:drawing>
           <wp:inline xmlns:a="http://schemas.openxmlformats.org/drawingml/2006/main" xmlns:pic="http://schemas.openxmlformats.org/drawingml/2006/picture">
-            <wp:extent cx="10287000" cy="5786438"/>
+            <wp:extent cx="9875520" cy="5554980"/>
             <wp:docPr id="7" name="Picture 7"/>
             <wp:cNvGraphicFramePr>
               <a:graphicFrameLocks noChangeAspect="1"/>
@@ -3536,7 +3536,7 @@
                   <pic:spPr>
                     <a:xfrm>
                       <a:off x="0" y="0"/>
-                      <a:ext cx="10287000" cy="5786438"/>
+                      <a:ext cx="9875520" cy="5554980"/>
                     </a:xfrm>
                     <a:prstGeom prst="rect"/>
                   </pic:spPr>
@@ -4015,7 +4015,7 @@
       <w:r>
         <w:drawing>
           <wp:inline xmlns:a="http://schemas.openxmlformats.org/drawingml/2006/main" xmlns:pic="http://schemas.openxmlformats.org/drawingml/2006/picture">
-            <wp:extent cx="10287000" cy="5786438"/>
+            <wp:extent cx="9875520" cy="5554980"/>
             <wp:docPr id="8" name="Picture 8"/>
             <wp:cNvGraphicFramePr>
               <a:graphicFrameLocks noChangeAspect="1"/>
@@ -4036,7 +4036,7 @@
                   <pic:spPr>
                     <a:xfrm>
                       <a:off x="0" y="0"/>
-                      <a:ext cx="10287000" cy="5786438"/>
+                      <a:ext cx="9875520" cy="5554980"/>
                     </a:xfrm>
                     <a:prstGeom prst="rect"/>
                   </pic:spPr>
@@ -4515,7 +4515,7 @@
       <w:r>
         <w:drawing>
           <wp:inline xmlns:a="http://schemas.openxmlformats.org/drawingml/2006/main" xmlns:pic="http://schemas.openxmlformats.org/drawingml/2006/picture">
-            <wp:extent cx="10287000" cy="5786438"/>
+            <wp:extent cx="9875520" cy="5554980"/>
             <wp:docPr id="9" name="Picture 9"/>
             <wp:cNvGraphicFramePr>
               <a:graphicFrameLocks noChangeAspect="1"/>
@@ -4536,7 +4536,7 @@
                   <pic:spPr>
                     <a:xfrm>
                       <a:off x="0" y="0"/>
-                      <a:ext cx="10287000" cy="5786438"/>
+                      <a:ext cx="9875520" cy="5554980"/>
                     </a:xfrm>
                     <a:prstGeom prst="rect"/>
                   </pic:spPr>
@@ -5015,7 +5015,7 @@
       <w:r>
         <w:drawing>
           <wp:inline xmlns:a="http://schemas.openxmlformats.org/drawingml/2006/main" xmlns:pic="http://schemas.openxmlformats.org/drawingml/2006/picture">
-            <wp:extent cx="10287000" cy="5786438"/>
+            <wp:extent cx="9875520" cy="5554980"/>
             <wp:docPr id="10" name="Picture 10"/>
             <wp:cNvGraphicFramePr>
               <a:graphicFrameLocks noChangeAspect="1"/>
@@ -5036,7 +5036,7 @@
                   <pic:spPr>
                     <a:xfrm>
                       <a:off x="0" y="0"/>
-                      <a:ext cx="10287000" cy="5786438"/>
+                      <a:ext cx="9875520" cy="5554980"/>
                     </a:xfrm>
                     <a:prstGeom prst="rect"/>
                   </pic:spPr>

</xml_diff>